<commit_message>
feat: Cosign, Get on Board y Torre al scraper; tracker nuevo; inglés B1 en todos los CVs
- buscar_portales.py: Cosign (accion publica jobSearchAction:search de su
  backend Convex), Get on Board (API v0 con empresa) y Torre (API POST,
  size<=20 con offset) entran a --scrape all. Filtro _tech_entry para
  agregadores masivos. Wellfound queda como link manual.
- feeds_telegram.yaml: canales apagados (sin avisos recientes al 26/09/2026).
- agente-libre.md y portales-argentina.md: fuentes nuevas, pasada con el
  navegador de Nacho (portal UADE y X), tracker nuevo.
- tracker/postulaciones.csv + contactos.csv: espejo de la Google Sheet
  Postulaciones_Ignacio_Palmeri (51 postulaciones). scripts/tracker_xlsx.py
  regenera el Excel. applications.csv queda como legacy (+12 filas del 26/09).
- 24 CVs personalizados viejos y docs de entrevista: ingles B1 (intermedio),
  nada por encima. PDFs/DOCX regenerados; validate_ats --all 136 PASS.

Co-Authored-By: Claude Opus 5.5 <noreply@anthropic.com>
</commit_message>
<xml_diff>
--- a/CV_Material_Nacho/extras/cvs_personalizados/Ignacio_Palmeri_Adecco_Calidad.docx
+++ b/CV_Material_Nacho/extras/cvs_personalizados/Ignacio_Palmeri_Adecco_Calidad.docx
@@ -408,7 +408,7 @@
         <w:pStyle w:val="ListBullet"/>
       </w:pPr>
       <w:r>
-        <w:t>Inglés: B1+/B2 autoevaluado.</w:t>
+        <w:t>Inglés: B1 (intermedio), autoevaluado, sin certificación formal. Leo documentación técnica en inglés.</w:t>
       </w:r>
     </w:p>
     <w:p>
@@ -432,7 +432,7 @@
         <w:pStyle w:val="ListBullet"/>
       </w:pPr>
       <w:r>
-        <w:t>Inglés: B1+/B2 — lectura técnica fluida, comunicación escrita y oral intermedia.</w:t>
+        <w:t>Inglés: B1 (intermedio), autoevaluado, sin certificación formal. Leo documentación técnica en inglés.</w:t>
       </w:r>
     </w:p>
     <w:p>

</xml_diff>